<commit_message>
Core: Update kinematics calculator
</commit_message>
<xml_diff>
--- a/Core/doc/DH Parameter.docx
+++ b/Core/doc/DH Parameter.docx
@@ -47,7 +47,6 @@
             <w:pPr>
               <w:jc w:val="center"/>
               <w:rPr>
-                <w:rFonts w:hint="eastAsia"/>
                 <w:i/>
               </w:rPr>
             </w:pPr>
@@ -244,9 +243,6 @@
           <w:p>
             <w:pPr>
               <w:jc w:val="center"/>
-              <w:rPr>
-                <w:rFonts w:hint="eastAsia"/>
-              </w:rPr>
             </w:pPr>
             <w:r>
               <w:rPr>
@@ -308,82 +304,6 @@
                     </m:r>
                   </m:sub>
                 </m:sSub>
-                <m:d>
-                  <m:dPr>
-                    <m:ctrlPr>
-                      <w:rPr>
-                        <w:rFonts w:ascii="Cambria Math" w:hAnsi="Cambria Math"/>
-                        <w:i/>
-                      </w:rPr>
-                    </m:ctrlPr>
-                  </m:dPr>
-                  <m:e>
-                    <m:r>
-                      <w:rPr>
-                        <w:rFonts w:ascii="Cambria Math" w:hAnsi="Cambria Math"/>
-                      </w:rPr>
-                      <m:t>-</m:t>
-                    </m:r>
-                    <m:f>
-                      <m:fPr>
-                        <m:ctrlPr>
-                          <w:rPr>
-                            <w:rFonts w:ascii="Cambria Math" w:hAnsi="Cambria Math"/>
-                            <w:i/>
-                          </w:rPr>
-                        </m:ctrlPr>
-                      </m:fPr>
-                      <m:num>
-                        <m:r>
-                          <w:rPr>
-                            <w:rFonts w:ascii="Cambria Math" w:hAnsi="Cambria Math"/>
-                          </w:rPr>
-                          <m:t>2π</m:t>
-                        </m:r>
-                      </m:num>
-                      <m:den>
-                        <m:r>
-                          <w:rPr>
-                            <w:rFonts w:ascii="Cambria Math" w:hAnsi="Cambria Math"/>
-                          </w:rPr>
-                          <m:t>3</m:t>
-                        </m:r>
-                      </m:den>
-                    </m:f>
-                    <m:r>
-                      <w:rPr>
-                        <w:rFonts w:ascii="Cambria Math" w:hAnsi="Cambria Math"/>
-                      </w:rPr>
-                      <m:t>,</m:t>
-                    </m:r>
-                    <m:f>
-                      <m:fPr>
-                        <m:ctrlPr>
-                          <w:rPr>
-                            <w:rFonts w:ascii="Cambria Math" w:hAnsi="Cambria Math"/>
-                            <w:i/>
-                          </w:rPr>
-                        </m:ctrlPr>
-                      </m:fPr>
-                      <m:num>
-                        <m:r>
-                          <w:rPr>
-                            <w:rFonts w:ascii="Cambria Math" w:hAnsi="Cambria Math"/>
-                          </w:rPr>
-                          <m:t>2π</m:t>
-                        </m:r>
-                      </m:num>
-                      <m:den>
-                        <m:r>
-                          <w:rPr>
-                            <w:rFonts w:ascii="Cambria Math" w:hAnsi="Cambria Math"/>
-                          </w:rPr>
-                          <m:t>3</m:t>
-                        </m:r>
-                      </m:den>
-                    </m:f>
-                  </m:e>
-                </m:d>
               </m:oMath>
             </m:oMathPara>
           </w:p>
@@ -460,52 +380,6 @@
             <w:pPr>
               <w:jc w:val="center"/>
             </w:pPr>
-            <m:oMathPara>
-              <m:oMath>
-                <m:sSub>
-                  <m:sSubPr>
-                    <m:ctrlPr>
-                      <w:rPr>
-                        <w:rFonts w:ascii="Cambria Math" w:hAnsi="Cambria Math"/>
-                        <w:i/>
-                      </w:rPr>
-                    </m:ctrlPr>
-                  </m:sSubPr>
-                  <m:e>
-                    <m:r>
-                      <w:rPr>
-                        <w:rFonts w:ascii="Cambria Math" w:hAnsi="Cambria Math" w:hint="eastAsia"/>
-                      </w:rPr>
-                      <m:t>l</m:t>
-                    </m:r>
-                    <m:ctrlPr>
-                      <w:rPr>
-                        <w:rFonts w:ascii="Cambria Math" w:hAnsi="Cambria Math" w:hint="eastAsia"/>
-                        <w:i/>
-                      </w:rPr>
-                    </m:ctrlPr>
-                  </m:e>
-                  <m:sub>
-                    <m:r>
-                      <w:rPr>
-                        <w:rFonts w:ascii="Cambria Math" w:hAnsi="Cambria Math"/>
-                      </w:rPr>
-                      <m:t>1</m:t>
-                    </m:r>
-                  </m:sub>
-                </m:sSub>
-              </m:oMath>
-            </m:oMathPara>
-          </w:p>
-        </w:tc>
-        <w:tc>
-          <w:tcPr>
-            <w:tcW w:w="1648" w:type="dxa"/>
-          </w:tcPr>
-          <w:p>
-            <w:pPr>
-              <w:jc w:val="center"/>
-            </w:pPr>
             <w:r>
               <w:rPr>
                 <w:rFonts w:hint="eastAsia"/>
@@ -516,6 +390,46 @@
         </w:tc>
         <w:tc>
           <w:tcPr>
+            <w:tcW w:w="1648" w:type="dxa"/>
+          </w:tcPr>
+          <w:p>
+            <w:pPr>
+              <w:jc w:val="center"/>
+            </w:pPr>
+            <m:oMathPara>
+              <m:oMath>
+                <m:sSub>
+                  <m:sSubPr>
+                    <m:ctrlPr>
+                      <w:rPr>
+                        <w:rFonts w:ascii="Cambria Math" w:hAnsi="Cambria Math"/>
+                        <w:i/>
+                      </w:rPr>
+                    </m:ctrlPr>
+                  </m:sSubPr>
+                  <m:e>
+                    <m:r>
+                      <w:rPr>
+                        <w:rFonts w:ascii="Cambria Math" w:hAnsi="Cambria Math"/>
+                      </w:rPr>
+                      <m:t>d</m:t>
+                    </m:r>
+                  </m:e>
+                  <m:sub>
+                    <m:r>
+                      <w:rPr>
+                        <w:rFonts w:ascii="Cambria Math" w:hAnsi="Cambria Math"/>
+                      </w:rPr>
+                      <m:t>2</m:t>
+                    </m:r>
+                  </m:sub>
+                </m:sSub>
+              </m:oMath>
+            </m:oMathPara>
+          </w:p>
+        </w:tc>
+        <w:tc>
+          <w:tcPr>
             <w:tcW w:w="1645" w:type="dxa"/>
           </w:tcPr>
           <w:p>
@@ -610,9 +524,9 @@
                   <m:e>
                     <m:r>
                       <w:rPr>
-                        <w:rFonts w:ascii="Cambria Math" w:hAnsi="Cambria Math"/>
-                      </w:rPr>
-                      <m:t>l</m:t>
+                        <w:rFonts w:ascii="Cambria Math" w:hAnsi="Cambria Math" w:hint="eastAsia"/>
+                      </w:rPr>
+                      <m:t>a</m:t>
                     </m:r>
                   </m:e>
                   <m:sub>
@@ -742,7 +656,7 @@
                       <w:rPr>
                         <w:rFonts w:ascii="Cambria Math" w:hAnsi="Cambria Math"/>
                       </w:rPr>
-                      <m:t>l</m:t>
+                      <m:t>a</m:t>
                     </m:r>
                   </m:e>
                   <m:sub>
@@ -842,6 +756,12 @@
             </w:pPr>
             <m:oMathPara>
               <m:oMath>
+                <m:r>
+                  <w:rPr>
+                    <w:rFonts w:ascii="Cambria Math" w:hAnsi="Cambria Math"/>
+                  </w:rPr>
+                  <m:t>-</m:t>
+                </m:r>
                 <m:f>
                   <m:fPr>
                     <m:ctrlPr>
@@ -895,13 +815,40 @@
           <w:p>
             <w:pPr>
               <w:jc w:val="center"/>
-            </w:pPr>
-            <w:r>
               <w:rPr>
                 <w:rFonts w:hint="eastAsia"/>
               </w:rPr>
-              <w:t>0</w:t>
-            </w:r>
+            </w:pPr>
+            <m:oMathPara>
+              <m:oMath>
+                <m:sSub>
+                  <m:sSubPr>
+                    <m:ctrlPr>
+                      <w:rPr>
+                        <w:rFonts w:ascii="Cambria Math" w:hAnsi="Cambria Math"/>
+                        <w:i/>
+                      </w:rPr>
+                    </m:ctrlPr>
+                  </m:sSubPr>
+                  <m:e>
+                    <m:r>
+                      <w:rPr>
+                        <w:rFonts w:ascii="Cambria Math" w:hAnsi="Cambria Math"/>
+                      </w:rPr>
+                      <m:t>d</m:t>
+                    </m:r>
+                  </m:e>
+                  <m:sub>
+                    <m:r>
+                      <w:rPr>
+                        <w:rFonts w:ascii="Cambria Math" w:hAnsi="Cambria Math"/>
+                      </w:rPr>
+                      <m:t>5</m:t>
+                    </m:r>
+                  </m:sub>
+                </m:sSub>
+              </m:oMath>
+            </m:oMathPara>
           </w:p>
         </w:tc>
         <w:tc>
@@ -1564,6 +1511,7 @@
   <w:style w:type="character" w:default="1" w:styleId="DefaultParagraphFont">
     <w:name w:val="Default Paragraph Font"/>
     <w:uiPriority w:val="1"/>
+    <w:semiHidden/>
     <w:unhideWhenUsed/>
   </w:style>
   <w:style w:type="table" w:default="1" w:styleId="TableNormal">

</xml_diff>